<commit_message>
docs: cover hygiene, release gate, and v1.0.0 in AI prompts log
</commit_message>
<xml_diff>
--- a/docs/development/AI_Prompts.docx
+++ b/docs/development/AI_Prompts.docx
@@ -520,6 +520,74 @@
       </w:pPr>
       <w:r>
         <w:t xml:space="preserve">Verified: backend npm ci plus lint plus tsc plus 57 tests plus build; frontend npm ci plus lint plus 12 tests plus build; docker compose build and live up with health connected and a live AI incident.</w:t>
+      </w:r>
+    </w:p>
+    <w:p>
+      <w:pPr>
+        <w:pStyle w:val="ListParagraph"/>
+        <w:numPr>
+          <w:ilvl w:val="0"/>
+          <w:numId w:val="2"/>
+        </w:numPr>
+      </w:pPr>
+      <w:r>
+        <w:t xml:space="preserve">Then updated these prompt logs (markdown plus docx) to match.</w:t>
+      </w:r>
+    </w:p>
+    <w:p>
+      <w:pPr>
+        <w:pStyle w:val="Heading2"/>
+      </w:pPr>
+      <w:r>
+        <w:t xml:space="preserve">2.8 Final hygiene, release gate, and v1.0.0</w:t>
+      </w:r>
+    </w:p>
+    <w:p>
+      <w:pPr>
+        <w:pStyle w:val="ListParagraph"/>
+        <w:numPr>
+          <w:ilvl w:val="0"/>
+          <w:numId w:val="2"/>
+        </w:numPr>
+      </w:pPr>
+      <w:r>
+        <w:t xml:space="preserve">Repository-hygiene pass: moved AI_Prompts files to docs/development, rewrote SECURITY.md for private vulnerability reporting, swept flagged terms.</w:t>
+      </w:r>
+    </w:p>
+    <w:p>
+      <w:pPr>
+        <w:pStyle w:val="ListParagraph"/>
+        <w:numPr>
+          <w:ilvl w:val="0"/>
+          <w:numId w:val="2"/>
+        </w:numPr>
+      </w:pPr>
+      <w:r>
+        <w:t xml:space="preserve">Release-gate audit (verification only): all suites and builds green, compose healthy, live smoke passed, quota-exhausted AI correctly falling back; fixed one gap, the missing backend build step in CI.</w:t>
+      </w:r>
+    </w:p>
+    <w:p>
+      <w:pPr>
+        <w:pStyle w:val="ListParagraph"/>
+        <w:numPr>
+          <w:ilvl w:val="0"/>
+          <w:numId w:val="2"/>
+        </w:numPr>
+      </w:pPr>
+      <w:r>
+        <w:t xml:space="preserve">Released v1.0.0: synced main, re-verified gates, tagged annotated v1.0.0 on the release commit, pushed the tag; gh release create blocked by token scope, release stays tag-only.</w:t>
+      </w:r>
+    </w:p>
+    <w:p>
+      <w:pPr>
+        <w:pStyle w:val="ListParagraph"/>
+        <w:numPr>
+          <w:ilvl w:val="0"/>
+          <w:numId w:val="2"/>
+        </w:numPr>
+      </w:pPr>
+      <w:r>
+        <w:t xml:space="preserve">Re-ran the release procedure later: refused to re-tag because v1.0.0 already exists on the same SHA; retried publication with the same 403.</w:t>
       </w:r>
     </w:p>
     <w:p>

</xml_diff>